<commit_message>
fix: correction index.js v3
</commit_message>
<xml_diff>
--- a/server/plantillas/Formato_IT_RD_V2_02.07.26.docx
+++ b/server/plantillas/Formato_IT_RD_V2_02.07.26.docx
@@ -5,7 +5,7 @@
     <w:tbl>
       <w:tblPr>
         <w:tblStyle w:val="Tablaconcuadrcula"/>
-        <w:tblpPr w:leftFromText="141" w:rightFromText="141" w:vertAnchor="page" w:horzAnchor="margin" w:tblpY="2139"/>
+        <w:tblpPr w:leftFromText="141" w:rightFromText="141" w:vertAnchor="page" w:horzAnchor="margin" w:tblpY="1959"/>
         <w:tblW w:w="0" w:type="auto"/>
         <w:tblLook w:val="04A0" w:firstRow="1" w:lastRow="0" w:firstColumn="1" w:lastColumn="0" w:noHBand="0" w:noVBand="1"/>
       </w:tblPr>
@@ -19,60 +19,23 @@
             <w:tcW w:w="4247" w:type="dxa"/>
           </w:tcPr>
           <w:p>
-            <w:pPr>
-              <w:tabs>
-                <w:tab w:val="left" w:pos="5012"/>
-              </w:tabs>
-              <w:rPr>
-                <w:lang w:val="es-MX"/>
-              </w:rPr>
-            </w:pPr>
             <w:r>
-              <w:rPr>
-                <w:lang w:val="es-MX"/>
-              </w:rPr>
+              <w:t>{#filas}</w:t>
+            </w:r>
+          </w:p>
+          <w:p>
+            <w:r>
               <w:t>{%foto1}</w:t>
             </w:r>
           </w:p>
+          <w:p/>
           <w:p>
-            <w:pPr>
-              <w:tabs>
-                <w:tab w:val="left" w:pos="5012"/>
-              </w:tabs>
-              <w:rPr>
-                <w:lang w:val="es-MX"/>
-              </w:rPr>
-            </w:pPr>
-          </w:p>
-          <w:p>
-            <w:pPr>
-              <w:tabs>
-                <w:tab w:val="left" w:pos="5012"/>
-              </w:tabs>
-              <w:rPr>
-                <w:lang w:val="es-MX"/>
-              </w:rPr>
-            </w:pPr>
             <w:r>
-              <w:rPr>
-                <w:lang w:val="es-MX"/>
-              </w:rPr>
               <w:t>Imagen {{num1}}: {{descripcion1}}</w:t>
             </w:r>
           </w:p>
           <w:p>
-            <w:pPr>
-              <w:tabs>
-                <w:tab w:val="left" w:pos="5012"/>
-              </w:tabs>
-              <w:rPr>
-                <w:lang w:val="es-MX"/>
-              </w:rPr>
-            </w:pPr>
             <w:r>
-              <w:rPr>
-                <w:lang w:val="es-MX"/>
-              </w:rPr>
               <w:t>Fecha: {{fecha1}}</w:t>
             </w:r>
           </w:p>
@@ -82,134 +45,39 @@
             <w:tcW w:w="4247" w:type="dxa"/>
           </w:tcPr>
           <w:p>
-            <w:pPr>
-              <w:tabs>
-                <w:tab w:val="left" w:pos="5012"/>
-              </w:tabs>
-              <w:rPr>
-                <w:lang w:val="es-MX"/>
-              </w:rPr>
-            </w:pPr>
             <w:r>
-              <w:rPr>
-                <w:lang w:val="es-MX"/>
-              </w:rPr>
-              <w:t>{?tiene2}</w:t>
+              <w:t>{#tiene2}</w:t>
             </w:r>
           </w:p>
           <w:p>
-            <w:pPr>
-              <w:tabs>
-                <w:tab w:val="left" w:pos="5012"/>
-              </w:tabs>
-              <w:rPr>
-                <w:lang w:val="es-MX"/>
-              </w:rPr>
-            </w:pPr>
             <w:r>
-              <w:rPr>
-                <w:lang w:val="es-MX"/>
-              </w:rPr>
               <w:t>{%foto2}</w:t>
             </w:r>
           </w:p>
+          <w:p/>
           <w:p>
-            <w:pPr>
-              <w:tabs>
-                <w:tab w:val="left" w:pos="5012"/>
-              </w:tabs>
-              <w:rPr>
-                <w:lang w:val="es-MX"/>
-              </w:rPr>
-            </w:pPr>
-          </w:p>
-          <w:p>
-            <w:pPr>
-              <w:tabs>
-                <w:tab w:val="left" w:pos="5012"/>
-              </w:tabs>
-              <w:rPr>
-                <w:lang w:val="es-MX"/>
-              </w:rPr>
-            </w:pPr>
             <w:r>
-              <w:rPr>
-                <w:lang w:val="es-MX"/>
-              </w:rPr>
               <w:t>Imagen {{num2}}: {{descripcion2}}</w:t>
             </w:r>
           </w:p>
           <w:p>
-            <w:pPr>
-              <w:tabs>
-                <w:tab w:val="left" w:pos="5012"/>
-              </w:tabs>
-              <w:rPr>
-                <w:lang w:val="es-MX"/>
-              </w:rPr>
-            </w:pPr>
             <w:r>
-              <w:rPr>
-                <w:lang w:val="es-MX"/>
-              </w:rPr>
               <w:t>Fecha: {{fecha2}}</w:t>
             </w:r>
           </w:p>
           <w:p>
-            <w:pPr>
-              <w:tabs>
-                <w:tab w:val="left" w:pos="5012"/>
-              </w:tabs>
-              <w:rPr>
-                <w:lang w:val="es-MX"/>
-              </w:rPr>
-            </w:pPr>
             <w:r>
-              <w:rPr>
-                <w:lang w:val="es-MX"/>
-              </w:rPr>
               <w:t>{/tiene2}</w:t>
+            </w:r>
+          </w:p>
+          <w:p>
+            <w:r>
+              <w:t>{/filas}</w:t>
             </w:r>
           </w:p>
         </w:tc>
       </w:tr>
     </w:tbl>
-    <w:p>
-      <w:pPr>
-        <w:tabs>
-          <w:tab w:val="left" w:pos="5012"/>
-        </w:tabs>
-        <w:rPr>
-          <w:lang w:val="es-MX"/>
-        </w:rPr>
-      </w:pPr>
-      <w:r>
-        <w:rPr>
-          <w:lang w:val="es-MX"/>
-        </w:rPr>
-        <w:t>{#filas}</w:t>
-      </w:r>
-    </w:p>
-    <w:p>
-      <w:pPr>
-        <w:rPr>
-          <w:lang w:val="es-MX"/>
-        </w:rPr>
-      </w:pPr>
-      <w:r>
-        <w:rPr>
-          <w:lang w:val="es-MX"/>
-        </w:rPr>
-        <w:t>{/filas}</w:t>
-      </w:r>
-    </w:p>
-    <w:p>
-      <w:pPr>
-        <w:rPr>
-          <w:lang w:val="es-MX"/>
-        </w:rPr>
-      </w:pPr>
-    </w:p>
     <w:p>
       <w:pPr>
         <w:rPr>

</xml_diff>